<commit_message>
Ingresso appendice settima e aggiornamento raccordo Moro (voce 52)
Acquisita l'appendice settima alla Fase Settima (la Commissione dichiara
il proprio standard; XII legislatura, doc. XXIII n.1 e n.3, 1995) e sua
undicesima regola della risalita: 'la sede conferisce pubblicita', non
grado'. Fonda sulla dichiarazione della fonte la gradazione gia' adottata
dal corpus per gli atti delle Commissioni (A per acquisizioni, B per
ricostruzioni). Raccordo aggiornato (DOCX + Excel): completo su 11
appendici su 12, resta fuori la sola prima. Registro verifiche a voce 52.

Co-Authored-By: Claude Fable 5 <noreply@anthropic.com>
Claude-Session: https://claude.ai/code/session_019coNthnDEGPwsM4yiT7gT7
</commit_message>
<xml_diff>
--- a/corpus/diagnostica/ITALIA_NERA_RACCORDO_FASE_SETTIMA_MORO.docx
+++ b/corpus/diagnostica/ITALIA_NERA_RACCORDO_FASE_SETTIMA_MORO.docx
@@ -149,6 +149,21 @@
           <w:b w:val="0"/>
           <w:sz w:val="24"/>
         </w:rPr>
+        <w:t>Fra tutte le appendici, la settima reca il contributo che piu' direttamente fonda il metodo comune, poiche' in essa la fonte medesima dichiara il proprio standard probatorio. Operando sulle due relazioni semestrali della dodicesima legislatura, comunicate nel millenovecentonovantacinque e stampate come documenti della serie ventitreesima ai numeri primo e terzo, l'appendice riporta la dichiarazione con cui la Commissione definisce il proprio grado: i suoi compiti non si identificano con quelli della magistratura, ed essa puo', e in taluni casi deve, andare oltre la prova intesa in senso strettamente processuale, che rispetto a fenomeni generalizzati e complessi potrebbe rivelarsi insufficiente o addirittura deformante. Da tale dichiarazione l'appendice trae quella che chiama l'undicesima regola della risalita: quando un organo dichiara il proprio standard, il grado delle sue ricostruzioni si fissa su quella dichiarazione e non sull'autorevolezza della sede, poiche' la sede conferisce pubblicita' e non conferisce grado, e una valutazione formulata dichiaratamente oltre la soglia della prova non acquista quella soglia per il fatto di essere stampata negli atti parlamentari. Questa regola non abbassa alcun grado, ma ne muta il fondamento: la cautela con cui il corpus assegnava agli atti delle Commissioni il grado massimo per le acquisizioni documentali e il grado intermedio per le ricostruzioni e le valutazioni, cautela adottata sin qui per prudenza dell'autore, riposa ora sulla dichiarazione dell'organo graduato medesimo. E' un mutamento di natura e non di esito, ed e' la piu' solida delle conferme che il corpus potesse ricevere: la sua prudenza, esemplificata alla voce quaranta là dove i documenti parlamentari del filone Hyperion furono registrati ma il proscioglimento finale li mantenne al grado del candidato, si scopre coincidente con l'autolimitazione dichiarata dalla fonte parlamentare stessa.</w:t>
+      </w:r>
+    </w:p>
+    <w:p>
+      <w:pPr>
+        <w:spacing w:line="276" w:lineRule="auto" w:before="0" w:after="0"/>
+        <w:ind w:firstLine="425"/>
+        <w:jc w:val="both"/>
+      </w:pPr>
+      <w:r>
+        <w:rPr>
+          <w:rFonts w:ascii="Times New Roman" w:hAnsi="Times New Roman" w:cs="Times New Roman" w:eastAsia="Times New Roman"/>
+          <w:b w:val="0"/>
+          <w:sz w:val="24"/>
+        </w:rPr>
         <w:t>Da questo raccordo discende un duplice arricchimento. La Fase Settima aggiunge al corpus la prova esplicita che la distinzione fra il detenere e l'attestare, e fra la produzione e l'esposizione, che il corpus applicava agli attori e ai reperti, vale con identico rigore per le fonti, e offre un banco su cui misurare il collasso genealogico delle conclusioni balistiche, distinguendo quante di esse poggino su catene realmente indipendenti. Il corpus, per parte sua, aggiunge alla Fase Settima l'ampiezza dei domini: colloca il canale orientale nel contesto del lodo Moro, riconosce nei tre fascicoli della prova tre grandi nodi gia' mappati, e nel servizio estero delle cento pagine un archivio gia' iscritto nella lista operativa. Le due linee, insomma, si scambiano cio' che a ciascuna manca: alla profondita' del caso singolo, l'ampiezza della trama; all'ampiezza della trama, la profondita' del singolo caso.</w:t>
       </w:r>
     </w:p>
@@ -164,7 +179,7 @@
           <w:b w:val="0"/>
           <w:sz w:val="24"/>
         </w:rPr>
-        <w:t>Restano dichiarate, come lo statuto impone, le pendenze. La Fase Settima non e' integra nel corpus, poiche' del suo insieme mancano l'appendice prima e l'appendice settima, non pervenute; sino a che non saranno acquisite, il raccordo qui stabilito e' completo per le dieci appendici possedute e sospeso per le due assenti. La quarta persona dell'appendice ottava resta non identificata al lettore di questo raccordo, e il contenuto dell'audizione del ventuno gennaio duemila resta non posseduto, essendone non disponibile il resoconto. Le diciannove unita' non individuate dell'appendice quarta restano aperte, e sono l'omologo archivistico di quelle code irrisolte che, sul piano balistico, il corpus additava nella pistola mai ritrovata. Nessuna interrogazione in rete e' stata effettuata per il presente raccordo, che opera per ritorno al solo corpus gia' acquisito, in adempimento della prescrizione di collazione preventiva che la Tavola Unica istituisce; e il vincolo sulle fonti e' stato rispettato, senza alcun uso di Grokipedia ne' del quotidiano il manifesto.</w:t>
+        <w:t>Restano dichiarate, come lo statuto impone, le pendenze. Con l'acquisizione dell'appendice settima, che questo raccordo incorpora, della serie manca ora la sola appendice prima, non pervenuta; sino a che non sara' acquisita, il raccordo qui stabilito e' completo per le undici appendici possedute e sospeso per la sola assente. La quarta persona dell'appendice ottava resta non identificata al lettore di questo raccordo, e il contenuto dell'audizione del ventuno gennaio duemila resta non posseduto, essendone non disponibile il resoconto. Le diciannove unita' non individuate dell'appendice quarta restano aperte, e sono l'omologo archivistico di quelle code irrisolte che, sul piano balistico, il corpus additava nella pistola mai ritrovata. Nessuna interrogazione in rete e' stata effettuata per il presente raccordo, che opera per ritorno al solo corpus gia' acquisito, in adempimento della prescrizione di collazione preventiva che la Tavola Unica istituisce; e il vincolo sulle fonti e' stato rispettato, senza alcun uso di Grokipedia ne' del quotidiano il manifesto.</w:t>
       </w:r>
     </w:p>
     <w:p>
@@ -270,6 +285,21 @@
           <w:sz w:val="24"/>
         </w:rPr>
         <w:t>corpus/opera/ALDO_MORO_APPENDICE_SESTA_FASE_SETTIMA.docx</w:t>
+      </w:r>
+    </w:p>
+    <w:p>
+      <w:pPr>
+        <w:spacing w:line="276" w:lineRule="auto" w:before="0" w:after="0"/>
+        <w:ind w:firstLine="425"/>
+        <w:jc w:val="both"/>
+      </w:pPr>
+      <w:r>
+        <w:rPr>
+          <w:rFonts w:ascii="Times New Roman" w:hAnsi="Times New Roman" w:cs="Times New Roman" w:eastAsia="Times New Roman"/>
+          <w:b w:val="0"/>
+          <w:sz w:val="24"/>
+        </w:rPr>
+        <w:t>corpus/opera/ALDO_MORO_APPENDICE_SETTIMA_FASE_SETTIMA.docx</w:t>
       </w:r>
     </w:p>
     <w:p>

</xml_diff>

<commit_message>
Ingresso appendici prima/14a/15a Fase Settima e aggiornamento raccordo (voce 53)
Acquisite tre nuove appendici Moro: la prima/base (Tavola accresciuta,
19 voci, Regola di Ferro = statuto Savona), la quattordicesima (schede
delle stragi 1969-1984, aggancio ai nodi-stragi della voce 45) e la
quindicesima (relazione XII leg. non discussa; corollario dell'undicesima
regola). Raccordo aggiornato (DOCX + Excel): completo su 14 appendici su
15, resta fuori la sola tredicesima. Registro verifiche a voce 53.

Co-Authored-By: Claude Fable 5 <noreply@anthropic.com>
Claude-Session: https://claude.ai/code/session_019coNthnDEGPwsM4yiT7gT7
</commit_message>
<xml_diff>
--- a/corpus/diagnostica/ITALIA_NERA_RACCORDO_FASE_SETTIMA_MORO.docx
+++ b/corpus/diagnostica/ITALIA_NERA_RACCORDO_FASE_SETTIMA_MORO.docx
@@ -164,6 +164,36 @@
           <w:b w:val="0"/>
           <w:sz w:val="24"/>
         </w:rPr>
+        <w:t>L'acquisizione successiva di altre tre appendici, la prima e le due che chiudono la serie sino alla quindicesima, conferma e allarga il quadro. L'appendice prima, che il documento intitola semplicemente appendice alla Fase Settima e dedica alla tavola accresciuta delle acquisizioni necessarie, e' la base dell'intera serie, poiche' accresce il Capitolo sessantanovesimo dell'opera Moro e vi iscrive le diciannove voci con la loro condizione di chiusura e di smentita. In essa e' formulata, nella sua veste piu' nuda, la regola che governa entrambe le linee, e che l'appendice chiama Regola di Ferro: dove la fonte documenta, l'opera certifica; dove la fonte tace, l'opera indaga e non afferma. E' la medesima proposizione che il corpus ITALIA NERA ha praticato sotto il nome di Sistema Savona, e la sua comparsa a fondamento della Fase Settima non e' una coincidenza, ma la prova che le due opere discendono da un unico giuramento.</w:t>
+      </w:r>
+    </w:p>
+    <w:p>
+      <w:pPr>
+        <w:spacing w:line="276" w:lineRule="auto" w:before="0" w:after="0"/>
+        <w:ind w:firstLine="425"/>
+        <w:jc w:val="both"/>
+      </w:pPr>
+      <w:r>
+        <w:rPr>
+          <w:rFonts w:ascii="Times New Roman" w:hAnsi="Times New Roman" w:cs="Times New Roman" w:eastAsia="Times New Roman"/>
+          <w:b w:val="0"/>
+          <w:sz w:val="24"/>
+        </w:rPr>
+        <w:t>L'appendice quattordicesima porta il raccordo sul terreno che piu' direttamente appartiene al corpus, poiche' opera sulle schede informative allegate alla relazione parlamentare sulle stragi meno recenti del periodo che va dal millenovecentosessantanove al millenovecentottantaquattro, della quale si possiede la trascrizione di trentasei pagine. Sono le stragi che il corpus ha triangolato alla voce quarantacinque, da piazza Fontana alla stazione di Bologna, da piazza della Loggia a Peteano; e l'appendice, respingendo quello che chiama un errore che dispensa dal cercare, ossia la comodita' di dare per acquisita una classe di comparazione che in realta' non esiste negli atti, applica alle schede parlamentari la stessa disciplina di non-inferenza con cui il corpus si e' guardato dal dedurre la committenza dalla convergenza. L'appendice quindicesima, infine, operando sulla terza relazione semestrale della dodicesima legislatura, comunicata nel febbraio del millenovecentonovantasei, aggiunge un corollario prezioso all'undicesima regola: una proposta depositata e non discussa non acquista grado dal solo fatto del deposito, cosi' come una valutazione non acquista la soglia della prova dal solo fatto della stampa. La sede, di nuovo, conferisce pubblicita' e non conferisce grado.</w:t>
+      </w:r>
+    </w:p>
+    <w:p>
+      <w:pPr>
+        <w:spacing w:line="276" w:lineRule="auto" w:before="0" w:after="0"/>
+        <w:ind w:firstLine="425"/>
+        <w:jc w:val="both"/>
+      </w:pPr>
+      <w:r>
+        <w:rPr>
+          <w:rFonts w:ascii="Times New Roman" w:hAnsi="Times New Roman" w:cs="Times New Roman" w:eastAsia="Times New Roman"/>
+          <w:b w:val="0"/>
+          <w:sz w:val="24"/>
+        </w:rPr>
         <w:t>Da questo raccordo discende un duplice arricchimento. La Fase Settima aggiunge al corpus la prova esplicita che la distinzione fra il detenere e l'attestare, e fra la produzione e l'esposizione, che il corpus applicava agli attori e ai reperti, vale con identico rigore per le fonti, e offre un banco su cui misurare il collasso genealogico delle conclusioni balistiche, distinguendo quante di esse poggino su catene realmente indipendenti. Il corpus, per parte sua, aggiunge alla Fase Settima l'ampiezza dei domini: colloca il canale orientale nel contesto del lodo Moro, riconosce nei tre fascicoli della prova tre grandi nodi gia' mappati, e nel servizio estero delle cento pagine un archivio gia' iscritto nella lista operativa. Le due linee, insomma, si scambiano cio' che a ciascuna manca: alla profondita' del caso singolo, l'ampiezza della trama; all'ampiezza della trama, la profondita' del singolo caso.</w:t>
       </w:r>
     </w:p>
@@ -179,7 +209,7 @@
           <w:b w:val="0"/>
           <w:sz w:val="24"/>
         </w:rPr>
-        <w:t>Restano dichiarate, come lo statuto impone, le pendenze. Con l'acquisizione dell'appendice settima, che questo raccordo incorpora, della serie manca ora la sola appendice prima, non pervenuta; sino a che non sara' acquisita, il raccordo qui stabilito e' completo per le undici appendici possedute e sospeso per la sola assente. La quarta persona dell'appendice ottava resta non identificata al lettore di questo raccordo, e il contenuto dell'audizione del ventuno gennaio duemila resta non posseduto, essendone non disponibile il resoconto. Le diciannove unita' non individuate dell'appendice quarta restano aperte, e sono l'omologo archivistico di quelle code irrisolte che, sul piano balistico, il corpus additava nella pistola mai ritrovata. Nessuna interrogazione in rete e' stata effettuata per il presente raccordo, che opera per ritorno al solo corpus gia' acquisito, in adempimento della prescrizione di collazione preventiva che la Tavola Unica istituisce; e il vincolo sulle fonti e' stato rispettato, senza alcun uso di Grokipedia ne' del quotidiano il manifesto.</w:t>
+        <w:t>Restano dichiarate, come lo statuto impone, le pendenze. La serie, che si e' rivelata piu' ampia di quanto dapprima apparisse, si estende ora sino alla quindicesima appendice, e di essa il corpus possiede quattordici documenti, ovvero la prima a fondamento, le appendici dalla seconda alla dodicesima, e la quattordicesima e la quindicesima; manca la sola appendice tredicesima, non pervenuta, sicche' il raccordo e' completo per le quattordici possedute e sospeso per l'unica assente. La quarta persona dell'appendice ottava resta non identificata al lettore di questo raccordo, e il contenuto dell'audizione del ventuno gennaio duemila resta non posseduto, essendone non disponibile il resoconto. Le diciannove unita' non individuate dell'appendice quarta restano aperte, e sono l'omologo archivistico di quelle code irrisolte che, sul piano balistico, il corpus additava nella pistola mai ritrovata. Nessuna interrogazione in rete e' stata effettuata per il presente raccordo, che opera per ritorno al solo corpus gia' acquisito, in adempimento della prescrizione di collazione preventiva che la Tavola Unica istituisce; e il vincolo sulle fonti e' stato rispettato, senza alcun uso di Grokipedia ne' del quotidiano il manifesto.</w:t>
       </w:r>
     </w:p>
     <w:p>
@@ -210,6 +240,21 @@
           <w:sz w:val="24"/>
         </w:rPr>
         <w:t>Fonti e URL</w:t>
+      </w:r>
+    </w:p>
+    <w:p>
+      <w:pPr>
+        <w:spacing w:line="276" w:lineRule="auto" w:before="0" w:after="0"/>
+        <w:ind w:firstLine="425"/>
+        <w:jc w:val="both"/>
+      </w:pPr>
+      <w:r>
+        <w:rPr>
+          <w:rFonts w:ascii="Times New Roman" w:hAnsi="Times New Roman" w:cs="Times New Roman" w:eastAsia="Times New Roman"/>
+          <w:b w:val="0"/>
+          <w:sz w:val="24"/>
+        </w:rPr>
+        <w:t>corpus/opera/ALDO_MORO_APPENDICE_PRIMA_FASE_SETTIMA.docx</w:t>
       </w:r>
     </w:p>
     <w:p>
@@ -375,6 +420,36 @@
           <w:sz w:val="24"/>
         </w:rPr>
         <w:t>corpus/opera/ALDO_MORO_APPENDICE_DODICESIMA_FASE_SETTIMA.docx</w:t>
+      </w:r>
+    </w:p>
+    <w:p>
+      <w:pPr>
+        <w:spacing w:line="276" w:lineRule="auto" w:before="0" w:after="0"/>
+        <w:ind w:firstLine="425"/>
+        <w:jc w:val="both"/>
+      </w:pPr>
+      <w:r>
+        <w:rPr>
+          <w:rFonts w:ascii="Times New Roman" w:hAnsi="Times New Roman" w:cs="Times New Roman" w:eastAsia="Times New Roman"/>
+          <w:b w:val="0"/>
+          <w:sz w:val="24"/>
+        </w:rPr>
+        <w:t>corpus/opera/ALDO_MORO_APPENDICE_QUATTORDICESIMA_FASE_SETTIMA.docx</w:t>
+      </w:r>
+    </w:p>
+    <w:p>
+      <w:pPr>
+        <w:spacing w:line="276" w:lineRule="auto" w:before="0" w:after="0"/>
+        <w:ind w:firstLine="425"/>
+        <w:jc w:val="both"/>
+      </w:pPr>
+      <w:r>
+        <w:rPr>
+          <w:rFonts w:ascii="Times New Roman" w:hAnsi="Times New Roman" w:cs="Times New Roman" w:eastAsia="Times New Roman"/>
+          <w:b w:val="0"/>
+          <w:sz w:val="24"/>
+        </w:rPr>
+        <w:t>corpus/opera/ALDO_MORO_APPENDICE_QUINDICESIMA_FASE_SETTIMA.docx</w:t>
       </w:r>
     </w:p>
     <w:p>

</xml_diff>

<commit_message>
Ingresso appendice tredicesima e chiusura della serie Fase Settima (voce 54)
Acquisita l'ultima appendice mancante (tredicesima, 'Una sola testimonianza
formale', Voce 46): dichiara e risolve per inferenza posizionale, verificata
su 5 ancoraggi, un difetto OCR degli ordinali delle sedute, correggendo la
dodicesima - modello da laboratorio della disciplina comune. Il corpus
possiede ora tutte le 15 appendici della Fase Settima: raccordo chiuso.
Registro verifiche a voce 54.

Co-Authored-By: Claude Fable 5 <noreply@anthropic.com>
Claude-Session: https://claude.ai/code/session_019coNthnDEGPwsM4yiT7gT7
</commit_message>
<xml_diff>
--- a/corpus/diagnostica/ITALIA_NERA_RACCORDO_FASE_SETTIMA_MORO.docx
+++ b/corpus/diagnostica/ITALIA_NERA_RACCORDO_FASE_SETTIMA_MORO.docx
@@ -194,6 +194,36 @@
           <w:b w:val="0"/>
           <w:sz w:val="24"/>
         </w:rPr>
+        <w:t>L'appendice tredicesima, ultima a pervenire e per cio' stesso a chiudere la serie, offre il piu' fine dei riscontri metodologici, poiche' in essa la disciplina comune si esercita non su un contenuto, ma sulla stessa affidabilita' materiale della fonte. Eseguendo la quarantaseiesima voce, che prescrive di ricavare dal prospetto analitico delle sedute l'oggetto delle ventisette sedute i cui processi verbali non sono posseduti, l'appendice si imbatte in un difetto della trascrizione e lo dichiara prima di ogni altra cosa: il riconoscimento ottico aveva deformato l'indicatore ordinale che segue il numero di seduta, sicche' la prima seduta compariva come diciottesima, la seconda come ventiquattresima, e la lettura ingenua produceva una collazione interamente errata e, quel che e' peggio, errata in modo plausibile, con numeri e date verosimili attribuiti a sedute reali. L'errore, non rilevabile dall'interno, fu colto per un'evidenza esterna al conteggio, ossia constatando che la prima seduta di una Commissione non puo' essere la diciottesima; e fu risolto per via posizionale, assumendo che l'ennesima voce del prospetto cronologico corrisponda all'ennesima seduta, con verifica su cinque ancoraggi indipendenti costituiti da processi verbali posseduti dei quali si conoscono numero e data. E' dichiarato, con la consueta lealta', che la risoluzione e' un'inferenza dell'opera e non un dato del documento, e che essa e' falsificabile con un esemplare a stampa correttamente impaginato.</w:t>
+      </w:r>
+    </w:p>
+    <w:p>
+      <w:pPr>
+        <w:spacing w:line="276" w:lineRule="auto" w:before="0" w:after="0"/>
+        <w:ind w:firstLine="425"/>
+        <w:jc w:val="both"/>
+      </w:pPr>
+      <w:r>
+        <w:rPr>
+          <w:rFonts w:ascii="Times New Roman" w:hAnsi="Times New Roman" w:cs="Times New Roman" w:eastAsia="Times New Roman"/>
+          <w:b w:val="0"/>
+          <w:sz w:val="24"/>
+        </w:rPr>
+        <w:t>In questa vicenda minuta si legge, come in un modello da laboratorio, l'intera disciplina che le due linee condividono: il difetto della fonte dichiarato anziche' taciuto, l'errore plausibile riconosciuto come la specie peggiore, l'inferenza tenuta distinta dal dato, la verifica condotta su ancoraghi indipendenti, la falsificabilita' offerta al lettore. E' la medesima operazione che il corpus ITALIA NERA ha compiuto quando, di fronte a un dato d'archivio non posseduto, ne ha registrato l'indirizzo e non il contenuto, e quando ha dichiarato falsificabile ogni propria ricostruzione. Non e' senza significato, infine, che l'appendice si intitoli a una sola testimonianza formale: essa accerta, fra gli auditi in sede formale, quanto scarse siano le deposizioni che realmente riguardano il caso, e in tale scarsita' si tocca con mano, sul piano delle fonti dichiarative, quel collasso genealogico che e' il cuore della Fase Settima e il corrispondente esatto, nel corpus, della distinzione fra la convergenza di molte voci e la sostanza di poche catene indipendenti.</w:t>
+      </w:r>
+    </w:p>
+    <w:p>
+      <w:pPr>
+        <w:spacing w:line="276" w:lineRule="auto" w:before="0" w:after="0"/>
+        <w:ind w:firstLine="425"/>
+        <w:jc w:val="both"/>
+      </w:pPr>
+      <w:r>
+        <w:rPr>
+          <w:rFonts w:ascii="Times New Roman" w:hAnsi="Times New Roman" w:cs="Times New Roman" w:eastAsia="Times New Roman"/>
+          <w:b w:val="0"/>
+          <w:sz w:val="24"/>
+        </w:rPr>
         <w:t>Da questo raccordo discende un duplice arricchimento. La Fase Settima aggiunge al corpus la prova esplicita che la distinzione fra il detenere e l'attestare, e fra la produzione e l'esposizione, che il corpus applicava agli attori e ai reperti, vale con identico rigore per le fonti, e offre un banco su cui misurare il collasso genealogico delle conclusioni balistiche, distinguendo quante di esse poggino su catene realmente indipendenti. Il corpus, per parte sua, aggiunge alla Fase Settima l'ampiezza dei domini: colloca il canale orientale nel contesto del lodo Moro, riconosce nei tre fascicoli della prova tre grandi nodi gia' mappati, e nel servizio estero delle cento pagine un archivio gia' iscritto nella lista operativa. Le due linee, insomma, si scambiano cio' che a ciascuna manca: alla profondita' del caso singolo, l'ampiezza della trama; all'ampiezza della trama, la profondita' del singolo caso.</w:t>
       </w:r>
     </w:p>
@@ -209,7 +239,7 @@
           <w:b w:val="0"/>
           <w:sz w:val="24"/>
         </w:rPr>
-        <w:t>Restano dichiarate, come lo statuto impone, le pendenze. La serie, che si e' rivelata piu' ampia di quanto dapprima apparisse, si estende ora sino alla quindicesima appendice, e di essa il corpus possiede quattordici documenti, ovvero la prima a fondamento, le appendici dalla seconda alla dodicesima, e la quattordicesima e la quindicesima; manca la sola appendice tredicesima, non pervenuta, sicche' il raccordo e' completo per le quattordici possedute e sospeso per l'unica assente. La quarta persona dell'appendice ottava resta non identificata al lettore di questo raccordo, e il contenuto dell'audizione del ventuno gennaio duemila resta non posseduto, essendone non disponibile il resoconto. Le diciannove unita' non individuate dell'appendice quarta restano aperte, e sono l'omologo archivistico di quelle code irrisolte che, sul piano balistico, il corpus additava nella pistola mai ritrovata. Nessuna interrogazione in rete e' stata effettuata per il presente raccordo, che opera per ritorno al solo corpus gia' acquisito, in adempimento della prescrizione di collazione preventiva che la Tavola Unica istituisce; e il vincolo sulle fonti e' stato rispettato, senza alcun uso di Grokipedia ne' del quotidiano il manifesto.</w:t>
+        <w:t>Restano dichiarate, come lo statuto impone, le pendenze; ma sono ora pendenze interne alle appendici, e non piu' del raccordo. Con l'acquisizione dell'appendice tredicesima, che questa redazione incorpora, il corpus possiede l'intera serie della Fase Settima, dalla prima a fondamento sino alla quindicesima, senza che alcuna appendice manchi: il raccordo e' pertanto chiuso. Restano aperte, entro le singole appendici e come esse stesse dichiarano, la 'quarta persona' presente nella base e il contenuto dell'audizione del ventuno gennaio duemila, non posseduto, nonche' le diciannove unita' non individuate della quarta appendice, che sono l'omologo archivistico di quelle code irrisolte che, sul piano balistico, il corpus additava nella pistola mai ritrovata. La quarta persona dell'appendice ottava resta non identificata al lettore di questo raccordo, e il contenuto dell'audizione del ventuno gennaio duemila resta non posseduto, essendone non disponibile il resoconto. Le diciannove unita' non individuate dell'appendice quarta restano aperte, e sono l'omologo archivistico di quelle code irrisolte che, sul piano balistico, il corpus additava nella pistola mai ritrovata. Nessuna interrogazione in rete e' stata effettuata per il presente raccordo, che opera per ritorno al solo corpus gia' acquisito, in adempimento della prescrizione di collazione preventiva che la Tavola Unica istituisce; e il vincolo sulle fonti e' stato rispettato, senza alcun uso di Grokipedia ne' del quotidiano il manifesto.</w:t>
       </w:r>
     </w:p>
     <w:p>
@@ -420,6 +450,21 @@
           <w:sz w:val="24"/>
         </w:rPr>
         <w:t>corpus/opera/ALDO_MORO_APPENDICE_DODICESIMA_FASE_SETTIMA.docx</w:t>
+      </w:r>
+    </w:p>
+    <w:p>
+      <w:pPr>
+        <w:spacing w:line="276" w:lineRule="auto" w:before="0" w:after="0"/>
+        <w:ind w:firstLine="425"/>
+        <w:jc w:val="both"/>
+      </w:pPr>
+      <w:r>
+        <w:rPr>
+          <w:rFonts w:ascii="Times New Roman" w:hAnsi="Times New Roman" w:cs="Times New Roman" w:eastAsia="Times New Roman"/>
+          <w:b w:val="0"/>
+          <w:sz w:val="24"/>
+        </w:rPr>
+        <w:t>corpus/opera/ALDO_MORO_APPENDICE_TREDICESIMA_FASE_SETTIMA.docx</w:t>
       </w:r>
     </w:p>
     <w:p>

</xml_diff>